<commit_message>
Delete the useless files and upload the Final Report
</commit_message>
<xml_diff>
--- a/Group 22 Reflection Report.docx
+++ b/Group 22 Reflection Report.docx
@@ -137,13 +137,7 @@
         <w:t xml:space="preserve"> architecture.</w:t>
       </w:r>
     </w:p>
-    <w:p>
-      <w:pPr>
-        <w:rPr>
-          <w:rFonts w:hint="eastAsia"/>
-        </w:rPr>
-      </w:pPr>
-    </w:p>
+    <w:p/>
     <w:p>
       <w:pPr>
         <w:rPr>
@@ -387,7 +381,6 @@
     <w:p>
       <w:pPr>
         <w:rPr>
-          <w:rFonts w:hint="eastAsia"/>
           <w:b/>
           <w:bCs/>
           <w:sz w:val="32"/>
@@ -515,19 +508,11 @@
       </w:r>
       <w:proofErr w:type="spellStart"/>
       <w:r>
-        <w:t>get_</w:t>
-      </w:r>
-      <w:proofErr w:type="gramStart"/>
-      <w:r>
-        <w:t>reward</w:t>
+        <w:t>get_reward</w:t>
       </w:r>
       <w:proofErr w:type="spellEnd"/>
       <w:r>
-        <w:t>(</w:t>
-      </w:r>
-      <w:proofErr w:type="gramEnd"/>
-      <w:r>
-        <w:t xml:space="preserve">) interface. The object itself determines whether to </w:t>
+        <w:t xml:space="preserve">() interface. The object itself determines whether to </w:t>
       </w:r>
       <w:r>
         <w:lastRenderedPageBreak/>
@@ -723,26 +708,14 @@
         <w:t>Reflection</w:t>
       </w:r>
       <w:r>
-        <w:t xml:space="preserve">: This structure correctly implements </w:t>
-      </w:r>
-      <w:proofErr w:type="gramStart"/>
-      <w:r>
-        <w:t xml:space="preserve">the </w:t>
-      </w:r>
-      <w:r>
-        <w:rPr>
-          <w:b/>
-          <w:bCs/>
-        </w:rPr>
-        <w:t>Double</w:t>
-      </w:r>
-      <w:proofErr w:type="gramEnd"/>
-      <w:r>
-        <w:rPr>
-          <w:b/>
-          <w:bCs/>
-        </w:rPr>
-        <w:t xml:space="preserve"> DQN</w:t>
+        <w:t xml:space="preserve">: This structure correctly implements the </w:t>
+      </w:r>
+      <w:r>
+        <w:rPr>
+          <w:b/>
+          <w:bCs/>
+        </w:rPr>
+        <w:t>Double DQN</w:t>
       </w:r>
       <w:r>
         <w:t xml:space="preserve"> architecture. By maintaining a separate Target Network, we stabilized the training process and mitigated the overestimation bias inherent in standard Q-Learning.</w:t>
@@ -793,15 +766,7 @@
         <w:t>Part 2</w:t>
       </w:r>
       <w:r>
-        <w:t xml:space="preserve">: The Q-Table simply memorized the value of specific coordinates $(x, </w:t>
-      </w:r>
-      <w:proofErr w:type="gramStart"/>
-      <w:r>
-        <w:t>y)$</w:t>
-      </w:r>
-      <w:proofErr w:type="gramEnd"/>
-      <w:r>
-        <w:t>.</w:t>
+        <w:t>: The Q-Table simply memorized the value of specific coordinates $(x, y)$.</w:t>
       </w:r>
     </w:p>
     <w:p>
@@ -881,25 +846,43 @@
           <w:kern w:val="0"/>
           <w14:ligatures w14:val="none"/>
         </w:rPr>
-        <w:t xml:space="preserve">This project demonstrated </w:t>
-      </w:r>
-      <w:proofErr w:type="gramStart"/>
+        <w:t xml:space="preserve">This project demonstrated a progression from foundational to advanced Reinforcement Learning implementation. In </w:t>
+      </w:r>
+      <w:r>
+        <w:rPr>
+          <w:rFonts w:asciiTheme="majorHAnsi" w:eastAsia="新細明體" w:hAnsiTheme="majorHAnsi" w:cs="新細明體"/>
+          <w:b/>
+          <w:bCs/>
+          <w:kern w:val="0"/>
+          <w14:ligatures w14:val="none"/>
+        </w:rPr>
+        <w:t>Part 2</w:t>
+      </w:r>
       <w:r>
         <w:rPr>
           <w:rFonts w:asciiTheme="majorHAnsi" w:eastAsia="新細明體" w:hAnsiTheme="majorHAnsi" w:cs="新細明體"/>
           <w:kern w:val="0"/>
           <w14:ligatures w14:val="none"/>
         </w:rPr>
-        <w:t>a progression</w:t>
-      </w:r>
-      <w:proofErr w:type="gramEnd"/>
+        <w:t xml:space="preserve">, we learned to push the limits of traditional algorithms through </w:t>
+      </w:r>
+      <w:r>
+        <w:rPr>
+          <w:rFonts w:asciiTheme="majorHAnsi" w:eastAsia="新細明體" w:hAnsiTheme="majorHAnsi" w:cs="新細明體"/>
+          <w:b/>
+          <w:bCs/>
+          <w:kern w:val="0"/>
+          <w14:ligatures w14:val="none"/>
+        </w:rPr>
+        <w:t>Hyperparameter Tuning</w:t>
+      </w:r>
       <w:r>
         <w:rPr>
           <w:rFonts w:asciiTheme="majorHAnsi" w:eastAsia="新細明體" w:hAnsiTheme="majorHAnsi" w:cs="新細明體"/>
           <w:kern w:val="0"/>
           <w14:ligatures w14:val="none"/>
         </w:rPr>
-        <w:t xml:space="preserve"> from foundational to advanced Reinforcement Learning implementation. In </w:t>
+        <w:t xml:space="preserve"> and </w:t>
       </w:r>
       <w:r>
         <w:rPr>
@@ -909,7 +892,7 @@
           <w:kern w:val="0"/>
           <w14:ligatures w14:val="none"/>
         </w:rPr>
-        <w:t>Part 2</w:t>
+        <w:t>Reward Engineering</w:t>
       </w:r>
       <w:r>
         <w:rPr>
@@ -917,7 +900,7 @@
           <w:kern w:val="0"/>
           <w14:ligatures w14:val="none"/>
         </w:rPr>
-        <w:t xml:space="preserve">, we learned to push the limits of traditional algorithms through </w:t>
+        <w:t xml:space="preserve">. In </w:t>
       </w:r>
       <w:r>
         <w:rPr>
@@ -927,7 +910,7 @@
           <w:kern w:val="0"/>
           <w14:ligatures w14:val="none"/>
         </w:rPr>
-        <w:t>Hyperparameter Tuning</w:t>
+        <w:t>Part 3</w:t>
       </w:r>
       <w:r>
         <w:rPr>
@@ -935,7 +918,7 @@
           <w:kern w:val="0"/>
           <w14:ligatures w14:val="none"/>
         </w:rPr>
-        <w:t xml:space="preserve"> and </w:t>
+        <w:t xml:space="preserve">, we integrated </w:t>
       </w:r>
       <w:r>
         <w:rPr>
@@ -945,7 +928,7 @@
           <w:kern w:val="0"/>
           <w14:ligatures w14:val="none"/>
         </w:rPr>
-        <w:t>Reward Engineering</w:t>
+        <w:t>Software Engineering (OOP)</w:t>
       </w:r>
       <w:r>
         <w:rPr>
@@ -953,7 +936,7 @@
           <w:kern w:val="0"/>
           <w14:ligatures w14:val="none"/>
         </w:rPr>
-        <w:t xml:space="preserve">. In </w:t>
+        <w:t xml:space="preserve"> to manage system complexity and applied </w:t>
       </w:r>
       <w:r>
         <w:rPr>
@@ -963,7 +946,7 @@
           <w:kern w:val="0"/>
           <w14:ligatures w14:val="none"/>
         </w:rPr>
-        <w:t>Part 3</w:t>
+        <w:t>Deep Learning</w:t>
       </w:r>
       <w:r>
         <w:rPr>
@@ -971,72 +954,25 @@
           <w:kern w:val="0"/>
           <w14:ligatures w14:val="none"/>
         </w:rPr>
-        <w:t xml:space="preserve">, we integrated </w:t>
-      </w:r>
-      <w:r>
-        <w:rPr>
-          <w:rFonts w:asciiTheme="majorHAnsi" w:eastAsia="新細明體" w:hAnsiTheme="majorHAnsi" w:cs="新細明體"/>
-          <w:b/>
-          <w:bCs/>
-          <w:kern w:val="0"/>
-          <w14:ligatures w14:val="none"/>
-        </w:rPr>
-        <w:t>Software Engineering (OOP)</w:t>
-      </w:r>
-      <w:r>
-        <w:rPr>
-          <w:rFonts w:asciiTheme="majorHAnsi" w:eastAsia="新細明體" w:hAnsiTheme="majorHAnsi" w:cs="新細明體"/>
-          <w:kern w:val="0"/>
-          <w14:ligatures w14:val="none"/>
-        </w:rPr>
-        <w:t xml:space="preserve"> to manage system complexity and applied </w:t>
-      </w:r>
-      <w:r>
-        <w:rPr>
-          <w:rFonts w:asciiTheme="majorHAnsi" w:eastAsia="新細明體" w:hAnsiTheme="majorHAnsi" w:cs="新細明體"/>
-          <w:b/>
-          <w:bCs/>
-          <w:kern w:val="0"/>
-          <w14:ligatures w14:val="none"/>
-        </w:rPr>
-        <w:t>Deep Learning</w:t>
-      </w:r>
-      <w:r>
-        <w:rPr>
-          <w:rFonts w:asciiTheme="majorHAnsi" w:eastAsia="新細明體" w:hAnsiTheme="majorHAnsi" w:cs="新細明體"/>
-          <w:kern w:val="0"/>
-          <w14:ligatures w14:val="none"/>
-        </w:rPr>
         <w:t xml:space="preserve"> to solve problems with large, stochastic state spaces.</w:t>
       </w:r>
     </w:p>
-    <w:p>
-      <w:pPr>
+    <w:p/>
+    <w:p>
+      <w:r>
         <w:rPr>
           <w:rFonts w:hint="eastAsia"/>
         </w:rPr>
-      </w:pPr>
-    </w:p>
-    <w:p>
+        <w:t>The UML Diagram</w:t>
+      </w:r>
       <w:r>
         <w:rPr>
           <w:rFonts w:hint="eastAsia"/>
         </w:rPr>
-        <w:t>The UML Diagram</w:t>
-      </w:r>
-      <w:r>
-        <w:rPr>
-          <w:rFonts w:hint="eastAsia"/>
-        </w:rPr>
         <w:t xml:space="preserve"> of part3</w:t>
       </w:r>
     </w:p>
     <w:p>
-      <w:pPr>
-        <w:rPr>
-          <w:rFonts w:hint="eastAsia"/>
-        </w:rPr>
-      </w:pPr>
       <w:r>
         <w:rPr>
           <w:rFonts w:hint="eastAsia"/>
@@ -1085,12 +1021,49 @@
         </w:drawing>
       </w:r>
     </w:p>
-    <w:p>
-      <w:pPr>
+    <w:p/>
+    <w:p>
+      <w:r>
         <w:rPr>
           <w:rFonts w:hint="eastAsia"/>
         </w:rPr>
-      </w:pPr>
+        <w:t xml:space="preserve">Our </w:t>
+      </w:r>
+      <w:proofErr w:type="spellStart"/>
+      <w:r>
+        <w:rPr>
+          <w:rFonts w:hint="eastAsia"/>
+        </w:rPr>
+        <w:t>github</w:t>
+      </w:r>
+      <w:proofErr w:type="spellEnd"/>
+      <w:r>
+        <w:rPr>
+          <w:rFonts w:hint="eastAsia"/>
+        </w:rPr>
+        <w:t xml:space="preserve"> website</w:t>
+      </w:r>
+      <w:r>
+        <w:rPr>
+          <w:rFonts w:hint="eastAsia"/>
+        </w:rPr>
+        <w:t>：</w:t>
+      </w:r>
+    </w:p>
+    <w:p>
+      <w:pPr>
+        <w:rPr>
+          <w:rFonts w:hint="eastAsia"/>
+        </w:rPr>
+      </w:pPr>
+      <w:hyperlink r:id="rId6" w:history="1">
+        <w:r>
+          <w:rPr>
+            <w:rStyle w:val="ae"/>
+          </w:rPr>
+          <w:t>https://github.com/Kevin-trytry/Group-Project-main</w:t>
+        </w:r>
+      </w:hyperlink>
     </w:p>
     <w:sectPr>
       <w:pgSz w:w="11906" w:h="16838"/>
@@ -2287,6 +2260,7 @@
   <w:style w:type="character" w:default="1" w:styleId="a0">
     <w:name w:val="Default Paragraph Font"/>
     <w:uiPriority w:val="1"/>
+    <w:semiHidden/>
     <w:unhideWhenUsed/>
   </w:style>
   <w:style w:type="table" w:default="1" w:styleId="a1">
@@ -2612,6 +2586,29 @@
       <w:rFonts w:ascii="新細明體" w:eastAsia="新細明體" w:hAnsi="新細明體" w:cs="新細明體"/>
       <w:kern w:val="0"/>
       <w14:ligatures w14:val="none"/>
+    </w:rPr>
+  </w:style>
+  <w:style w:type="character" w:styleId="ae">
+    <w:name w:val="Hyperlink"/>
+    <w:basedOn w:val="a0"/>
+    <w:uiPriority w:val="99"/>
+    <w:unhideWhenUsed/>
+    <w:rsid w:val="00A92D6A"/>
+    <w:rPr>
+      <w:color w:val="467886" w:themeColor="hyperlink"/>
+      <w:u w:val="single"/>
+    </w:rPr>
+  </w:style>
+  <w:style w:type="character" w:styleId="af">
+    <w:name w:val="Unresolved Mention"/>
+    <w:basedOn w:val="a0"/>
+    <w:uiPriority w:val="99"/>
+    <w:semiHidden/>
+    <w:unhideWhenUsed/>
+    <w:rsid w:val="00A92D6A"/>
+    <w:rPr>
+      <w:color w:val="605E5C"/>
+      <w:shd w:val="clear" w:color="auto" w:fill="E1DFDD"/>
     </w:rPr>
   </w:style>
 </w:styles>

</xml_diff>